<commit_message>
Phases 92-94: G11-G35 result graphs, one figure registry, portable provenance
Phase 92: G11-G17 (model comparison, binary ROC/PR with T08 legend AUCs,
confusion matrices in fixed class order, multiclass OvR ROC reconciled to
each experiment's macro OvR AUC). Phase 93: G20-G22 moved into the graph
engine with plotted CSVs, G22 reconciled to the T57.4 sweep, G23/G24 moved
out of a second registry, G28 dataset-wise generalization. Phase 94: G29-G35
held to the gate (G30/G31/G32 equal T20/T21/T22), registry and metas made
repo-relative, G-series renumbered once into index order. T29/T30 re-run.

Co-Authored-By: Claude Opus 5 <noreply@anthropic.com>
</commit_message>
<xml_diff>
--- a/outputs/00_evidence_index/T29_objective_to_evidence_mapping.docx
+++ b/outputs/00_evidence_index/T29_objective_to_evidence_mapping.docx
@@ -308,7 +308,7 @@
               <w:rPr>
                 <w:sz w:val="18"/>
               </w:rPr>
-              <w:t>partial</w:t>
+              <w:t>evidence produced</w:t>
             </w:r>
           </w:p>
         </w:tc>
@@ -321,7 +321,7 @@
               <w:rPr>
                 <w:sz w:val="18"/>
               </w:rPr>
-              <w:t>G12-G14 ROC, precision-recall and confusion-matrix figures (Phase 92); the curve points and matrices they draw are produced</w:t>
+              <w:t>none</w:t>
             </w:r>
           </w:p>
         </w:tc>
@@ -1033,7 +1033,7 @@
               <w:rPr>
                 <w:sz w:val="18"/>
               </w:rPr>
-              <w:t>partial</w:t>
+              <w:t>evidence produced</w:t>
             </w:r>
           </w:p>
         </w:tc>
@@ -1046,7 +1046,7 @@
               <w:rPr>
                 <w:sz w:val="18"/>
               </w:rPr>
-              <w:t>G15-G17 multiclass confusion-matrix and one-vs-rest ROC figures (Phase 92); the matrices they draw are produced</w:t>
+              <w:t>none</w:t>
             </w:r>
           </w:p>
         </w:tc>
@@ -1134,7 +1134,7 @@
           <w:i/>
           <w:sz w:val="14"/>
         </w:rPr>
-        <w:t>Generated by PV-MEPCG / PulseVision at 2026-09-11T05:02:18.606826+00:00</w:t>
+        <w:t>Generated by PV-MEPCG / PulseVision at 2026-09-11T05:52:09.562897+00:00</w:t>
       </w:r>
     </w:p>
     <w:sectPr>

</xml_diff>

<commit_message>
Phases 99-101: ALG-11 to ALG-20, equations reference, literature review
- ALG-11..20 exported from the code (soft voting, evaluation, CirCor
  aggregation, external validation, robustness, failure analysis, reports,
  objective evidence); T99.7 re-implements ALG-11/12 from the printed
  pseudocode and matches soft_voting.py
- Equations reference: each section 11 formula cross-referenced to the
  line computing it, numerically verified, exported as LaTeX, CSV and DOCX
  with native Word equations (own LaTeX->OMML converter)
- Equation 8 now cites SoftVotingEnsemble.predict, not an unrelated argmax
- LIT-01 literature review (synopsis refs, 2016/2022 challenge benchmarks,
  recent work) and LIT-02 indicative PhysioNet comparison with split caveat,
  in outputs/16_literature_review; objective 2 now evidence produced

Co-Authored-By: Claude Opus 5 <noreply@anthropic.com>
</commit_message>
<xml_diff>
--- a/outputs/00_evidence_index/T29_objective_to_evidence_mapping.docx
+++ b/outputs/00_evidence_index/T29_objective_to_evidence_mapping.docx
@@ -414,7 +414,7 @@
               <w:rPr>
                 <w:sz w:val="18"/>
               </w:rPr>
-              <w:t>src/preprocessing/ablation.py; src/preprocessing/ablation_run.py; src/evaluation/feature_ablation.py; src/reporting/ablation_report.py</w:t>
+              <w:t>src/preprocessing/ablation.py; src/preprocessing/ablation_run.py; src/evaluation/feature_ablation.py; src/reporting/ablation_report.py; src/reporting/literature.py</w:t>
             </w:r>
           </w:p>
         </w:tc>
@@ -427,7 +427,7 @@
               <w:rPr>
                 <w:sz w:val="18"/>
               </w:rPr>
-              <w:t>outputs/02_preprocessing/preprocessing_ablation.csv; outputs/09_ablation/T17_feature_family_ablation.csv; outputs/09_ablation/T18_all_features_versus_selected_features.csv</w:t>
+              <w:t>outputs/02_preprocessing/preprocessing_ablation.csv; outputs/09_ablation/T17_feature_family_ablation.csv; outputs/09_ablation/T18_all_features_versus_selected_features.csv; outputs/16_literature_review/LIT-01_literature_review_and_state_of_the_art.csv</w:t>
             </w:r>
           </w:p>
         </w:tc>
@@ -440,7 +440,7 @@
               <w:rPr>
                 <w:sz w:val="18"/>
               </w:rPr>
-              <w:t>PP-09, T17, T18</w:t>
+              <w:t>PP-09, T17, T18, LIT-01, LIT-02</w:t>
             </w:r>
           </w:p>
         </w:tc>
@@ -453,7 +453,7 @@
               <w:rPr>
                 <w:sz w:val="18"/>
               </w:rPr>
-              <w:t>partial</w:t>
+              <w:t>evidence produced</w:t>
             </w:r>
           </w:p>
         </w:tc>
@@ -466,7 +466,7 @@
               <w:rPr>
                 <w:sz w:val="18"/>
               </w:rPr>
-              <w:t>Literature review table (Phase 101)</w:t>
+              <w:t>none</w:t>
             </w:r>
           </w:p>
         </w:tc>
@@ -1125,7 +1125,7 @@
           <w:i/>
           <w:sz w:val="14"/>
         </w:rPr>
-        <w:t>Source: outputs/06_binary_results/T08_physionet_individual_model_comparison.csv; outputs/06_binary_results/T10_physionet_fold_wise_results.csv; outputs/06_binary_results/EXP-A2/roc_pr_curve_points.csv; outputs/06_binary_results/EXP-A2/confusion_matrices.json; outputs/08_circor_external_validation/T16_cross_dataset_generalization.csv; outputs/09_ablation/T-S5_leave_one_source_out_generalization.csv; outputs/02_preprocessing/preprocessing_ablation.csv; outputs/09_ablation/T17_feature_family_ablation.csv; outputs/09_ablation/T18_all_features_versus_selected_features.csv; outputs/06_binary_results/T09_equal_weight_versus_optimized_ensemble.csv; outputs/09_ablation/T19_search_and_optimization_ablation.csv; outputs/10_robustness/T23_calibration_and_confidence_summary.csv; outputs/12_statistics/T28_statistical_significance_comparison.csv; outputs/09_robustness_analysis/T20_noise_robustness.csv; outputs/09_robustness_analysis/T21_duration_robustness.csv; outputs/08_circor_external_validation/T22_auscultation_location_analysis.csv; outputs/10_robustness/T27_false_positive_and_false_negative_analysis.csv; outputs/05_search_optimization/T07_search_space_and_best_parameters.csv; outputs/03_features/selected_feature_subset.csv; outputs/11_complexity/T24_complexity_analysis.csv; outputs/11_complexity/T25_training_and_inference_time.csv; outputs/11_complexity/T26_model_size_and_memory.csv; outputs/07_multiclass_results/T11_pascal_a_multiclass_results.csv; outputs/07_multiclass_results/T12_pascal_b_multiclass_results.csv; outputs/07_multiclass_results/EXP-B1/confusion_matrices.json; outputs/07_multiclass_results/EXP-B2/confusion_matrices.json; outputs/08_circor_external_validation/T13_circor_murmur_classification_results.csv; outputs/08_circor_external_validation/T14_circor_clinical_outcome_results.csv; outputs/08_circor_external_validation/T15_recording_level_versus_subject_level_results.csv</w:t>
+        <w:t>Source: outputs/06_binary_results/T08_physionet_individual_model_comparison.csv; outputs/06_binary_results/T10_physionet_fold_wise_results.csv; outputs/06_binary_results/EXP-A2/roc_pr_curve_points.csv; outputs/06_binary_results/EXP-A2/confusion_matrices.json; outputs/08_circor_external_validation/T16_cross_dataset_generalization.csv; outputs/09_ablation/T-S5_leave_one_source_out_generalization.csv; outputs/02_preprocessing/preprocessing_ablation.csv; outputs/09_ablation/T17_feature_family_ablation.csv; outputs/09_ablation/T18_all_features_versus_selected_features.csv; outputs/16_literature_review/LIT-01_literature_review_and_state_of_the_art.csv; outputs/06_binary_results/T09_equal_weight_versus_optimized_ensemble.csv; outputs/09_ablation/T19_search_and_optimization_ablation.csv; outputs/10_robustness/T23_calibration_and_confidence_summary.csv; outputs/12_statistics/T28_statistical_significance_comparison.csv; outputs/09_robustness_analysis/T20_noise_robustness.csv; outputs/09_robustness_analysis/T21_duration_robustness.csv; outputs/08_circor_external_validation/T22_auscultation_location_analysis.csv; outputs/10_robustness/T27_false_positive_and_false_negative_analysis.csv; outputs/05_search_optimization/T07_search_space_and_best_parameters.csv; outputs/03_features/selected_feature_subset.csv; outputs/11_complexity/T24_complexity_analysis.csv; outputs/11_complexity/T25_training_and_inference_time.csv; outputs/11_complexity/T26_model_size_and_memory.csv; outputs/07_multiclass_results/T11_pascal_a_multiclass_results.csv; outputs/07_multiclass_results/T12_pascal_b_multiclass_results.csv; outputs/07_multiclass_results/EXP-B1/confusion_matrices.json; outputs/07_multiclass_results/EXP-B2/confusion_matrices.json; outputs/08_circor_external_validation/T13_circor_murmur_classification_results.csv; outputs/08_circor_external_validation/T14_circor_clinical_outcome_results.csv; outputs/08_circor_external_validation/T15_recording_level_versus_subject_level_results.csv</w:t>
       </w:r>
     </w:p>
     <w:p>
@@ -1134,7 +1134,7 @@
           <w:i/>
           <w:sz w:val="14"/>
         </w:rPr>
-        <w:t>Generated by PV-MEPCG / PulseVision at 2026-09-11T05:52:09.562897+00:00</w:t>
+        <w:t>Generated by PV-MEPCG / PulseVision at 2026-09-11T13:18:03.537664+00:00</w:t>
       </w:r>
     </w:p>
     <w:sectPr>

</xml_diff>